<commit_message>
update syllabus before course start
</commit_message>
<xml_diff>
--- a/docs/syllabus.docx
+++ b/docs/syllabus.docx
@@ -140,7 +140,15 @@
         <w:pStyle w:val="FirstParagraph"/>
       </w:pPr>
       <w:r>
-        <w:t xml:space="preserve">Climate change communication influences how individuals, organizations, and societies perceive climate change, and how they react to it. In this course, we will discuss research findings in environmental psychology and communication science to understand specific challenges of climate change communication and how to address them.</w:t>
+        <w:t xml:space="preserve">Climate change communication influences how individuals, organizations, and societies perceive climate change, and how they react to it. In this course, students explore research from environmental psychology and communication science to understand how people respond to climate change messages and what makes communication effective. Students work in groups to evaluate climate change communication examples and propose evidence-informed improvements, presenting their analyses orally and reflecting on the process in writing. The course is pass/fail based on a group presentation and written individual reflection.</w:t>
+      </w:r>
+    </w:p>
+    <w:p>
+      <w:pPr>
+        <w:pStyle w:val="BodyText"/>
+      </w:pPr>
+      <w:r>
+        <w:t xml:space="preserve">For organisational reasons, participation in this course requires a course-internal commitment at latest by Friday, September 25, 2026 (23:59). After this date, groups/projects will be fixed, and students are expected to remain in the course. Students who do not intend to participate must delete the course from myStudies by the commitment deadline.</w:t>
       </w:r>
     </w:p>
     <w:bookmarkEnd w:id="26"/>
@@ -158,7 +166,7 @@
         <w:pStyle w:val="FirstParagraph"/>
       </w:pPr>
       <w:r>
-        <w:t xml:space="preserve">The course will provide students with an overview of current psychological theory and best practices in the area of climate change communication. At the completion of the course, students will be able to:</w:t>
+        <w:t xml:space="preserve">At the completion of the course, students will be able to:</w:t>
       </w:r>
     </w:p>
     <w:p>
@@ -170,7 +178,7 @@
         </w:numPr>
       </w:pPr>
       <w:r>
-        <w:t xml:space="preserve">Independently and accurately recognize challenges in climate change communication</w:t>
+        <w:t xml:space="preserve">Independently and accurately identify challenges in climate change communication</w:t>
       </w:r>
     </w:p>
     <w:p>
@@ -182,7 +190,7 @@
         </w:numPr>
       </w:pPr>
       <w:r>
-        <w:t xml:space="preserve">Clearly describe the psychological mechanisms that influence climate change perceptions and attitudes</w:t>
+        <w:t xml:space="preserve">Clearly explain the psychological mechanisms that influence climate change perceptions and attitudes</w:t>
       </w:r>
     </w:p>
     <w:p>
@@ -206,7 +214,7 @@
         </w:numPr>
       </w:pPr>
       <w:r>
-        <w:t xml:space="preserve">Strategically design an effective climate change communication campaign</w:t>
+        <w:t xml:space="preserve">Develop evidence-informed recommendations for improving climate change messages for specific audiences and communication contexts</w:t>
       </w:r>
     </w:p>
     <w:bookmarkEnd w:id="27"/>
@@ -269,6 +277,18 @@
         <w:t xml:space="preserve">. This is also where slides and additional materials will be posted.</w:t>
       </w:r>
     </w:p>
+    <w:p>
+      <w:pPr>
+        <w:pStyle w:val="Compact"/>
+        <w:numPr>
+          <w:ilvl w:val="0"/>
+          <w:numId w:val="1002"/>
+        </w:numPr>
+      </w:pPr>
+      <w:r>
+        <w:t xml:space="preserve">Students wishing to drop the course need to do so before 29.09.2026</w:t>
+      </w:r>
+    </w:p>
     <w:bookmarkEnd w:id="29"/>
     <w:bookmarkStart w:id="30" w:name="participation"/>
     <w:p>
@@ -305,7 +325,7 @@
         <w:t xml:space="preserve">“I’m lost, can you remind me why we’re talking about this?”</w:t>
       </w:r>
       <w:r>
-        <w:t xml:space="preserve">.</w:t>
+        <w:t xml:space="preserve">. Students are expected to read the main article assigned for each lecture and prepare three questions for each guest speaker.</w:t>
       </w:r>
     </w:p>
     <w:bookmarkEnd w:id="30"/>
@@ -343,7 +363,7 @@
       </w:r>
     </w:p>
     <w:bookmarkEnd w:id="31"/>
-    <w:bookmarkStart w:id="32" w:name="assessment"/>
+    <w:bookmarkStart w:id="34" w:name="assessment"/>
     <w:p>
       <w:pPr>
         <w:pStyle w:val="Heading2"/>
@@ -357,11 +377,272 @@
         <w:pStyle w:val="FirstParagraph"/>
       </w:pPr>
       <w:r>
-        <w:t xml:space="preserve">This class is not graded, students either pass or fail. Students are expected to prepare for class by completing assigned readings, attend all lectures, and meaningfully contribute to in-class exercises and discussion.</w:t>
+        <w:t xml:space="preserve">This class is not graded, students either pass or fail. Students are expected to prepare for class by completing assigned readings, attend lectures, and meaningfully contribute to in-class exercises and discussion. To pass the class, students need to</w:t>
+      </w:r>
+    </w:p>
+    <w:p>
+      <w:pPr>
+        <w:pStyle w:val="Compact"/>
+        <w:numPr>
+          <w:ilvl w:val="0"/>
+          <w:numId w:val="1003"/>
+        </w:numPr>
+      </w:pPr>
+      <w:r>
+        <w:t xml:space="preserve">present an example of climate change communication in an oral group presentation, and</w:t>
+      </w:r>
+    </w:p>
+    <w:p>
+      <w:pPr>
+        <w:pStyle w:val="Compact"/>
+        <w:numPr>
+          <w:ilvl w:val="0"/>
+          <w:numId w:val="1003"/>
+        </w:numPr>
+      </w:pPr>
+      <w:r>
+        <w:t xml:space="preserve">submit a one-page individual reflection on the group presentation.</w:t>
+      </w:r>
+    </w:p>
+    <w:bookmarkStart w:id="32" w:name="oral-group-presentation"/>
+    <w:p>
+      <w:pPr>
+        <w:pStyle w:val="Heading3"/>
+      </w:pPr>
+      <w:r>
+        <w:t xml:space="preserve">Oral group presentation</w:t>
+      </w:r>
+    </w:p>
+    <w:p>
+      <w:pPr>
+        <w:pStyle w:val="FirstParagraph"/>
+      </w:pPr>
+      <w:r>
+        <w:t xml:space="preserve">Groups present an example of climate change communication. Presentations start in week 5.</w:t>
+      </w:r>
+    </w:p>
+    <w:p>
+      <w:pPr>
+        <w:pStyle w:val="Compact"/>
+        <w:numPr>
+          <w:ilvl w:val="0"/>
+          <w:numId w:val="1004"/>
+        </w:numPr>
+      </w:pPr>
+      <w:r>
+        <w:t xml:space="preserve">Presentations last 10 minutes, followed by 5 minutes of Q&amp;A.</w:t>
+      </w:r>
+    </w:p>
+    <w:p>
+      <w:pPr>
+        <w:pStyle w:val="Compact"/>
+        <w:numPr>
+          <w:ilvl w:val="0"/>
+          <w:numId w:val="1004"/>
+        </w:numPr>
+      </w:pPr>
+      <w:r>
+        <w:t xml:space="preserve">Slides (PowerPoint or similar) are required.</w:t>
+      </w:r>
+    </w:p>
+    <w:p>
+      <w:pPr>
+        <w:pStyle w:val="Compact"/>
+        <w:numPr>
+          <w:ilvl w:val="0"/>
+          <w:numId w:val="1004"/>
+        </w:numPr>
+      </w:pPr>
+      <w:r>
+        <w:t xml:space="preserve">Any type of content or message that focuses on climate change can be presented as an example, such as an advertisement, political campaign, social media post (video or text), newspaper article, etc. You can present good or bad examples of climate change communication, including messages on climate change denial, and be as creative as you want.</w:t>
+      </w:r>
+    </w:p>
+    <w:p>
+      <w:pPr>
+        <w:pStyle w:val="Compact"/>
+        <w:numPr>
+          <w:ilvl w:val="0"/>
+          <w:numId w:val="1004"/>
+        </w:numPr>
+      </w:pPr>
+      <w:r>
+        <w:t xml:space="preserve">Presentations need to introduce the content/message, address the following questions, and explicitly draw on relevant concepts learned in the course:</w:t>
+      </w:r>
+    </w:p>
+    <w:p>
+      <w:pPr>
+        <w:pStyle w:val="Compact"/>
+        <w:numPr>
+          <w:ilvl w:val="1"/>
+          <w:numId w:val="1005"/>
+        </w:numPr>
+      </w:pPr>
+      <w:r>
+        <w:t xml:space="preserve">Introduce your example. How did you come across it and why did you pick it?</w:t>
+      </w:r>
+    </w:p>
+    <w:p>
+      <w:pPr>
+        <w:pStyle w:val="Compact"/>
+        <w:numPr>
+          <w:ilvl w:val="1"/>
+          <w:numId w:val="1005"/>
+        </w:numPr>
+      </w:pPr>
+      <w:r>
+        <w:t xml:space="preserve">Who is the communicator and what is their motivation?</w:t>
+      </w:r>
+    </w:p>
+    <w:p>
+      <w:pPr>
+        <w:pStyle w:val="Compact"/>
+        <w:numPr>
+          <w:ilvl w:val="1"/>
+          <w:numId w:val="1005"/>
+        </w:numPr>
+      </w:pPr>
+      <w:r>
+        <w:t xml:space="preserve">Who is the target audience?</w:t>
+      </w:r>
+    </w:p>
+    <w:p>
+      <w:pPr>
+        <w:pStyle w:val="Compact"/>
+        <w:numPr>
+          <w:ilvl w:val="1"/>
+          <w:numId w:val="1005"/>
+        </w:numPr>
+      </w:pPr>
+      <w:r>
+        <w:t xml:space="preserve">What makes this a good/bad example of climate change communication? Is the communicator reaching the right target audience with their message/content? Is the chosen medium appropriate to support the message, and why?</w:t>
+      </w:r>
+    </w:p>
+    <w:p>
+      <w:pPr>
+        <w:pStyle w:val="Compact"/>
+        <w:numPr>
+          <w:ilvl w:val="1"/>
+          <w:numId w:val="1005"/>
+        </w:numPr>
+      </w:pPr>
+      <w:r>
+        <w:t xml:space="preserve">How could the message/content be improved?</w:t>
+      </w:r>
+    </w:p>
+    <w:p>
+      <w:pPr>
+        <w:pStyle w:val="Compact"/>
+        <w:numPr>
+          <w:ilvl w:val="0"/>
+          <w:numId w:val="1004"/>
+        </w:numPr>
+      </w:pPr>
+      <w:r>
+        <w:t xml:space="preserve">You can use AI for the preparation of the presentation, but examples should be selected by group members.</w:t>
       </w:r>
     </w:p>
     <w:bookmarkEnd w:id="32"/>
-    <w:bookmarkStart w:id="49" w:name="course-structure"/>
+    <w:bookmarkStart w:id="33" w:name="reflection-task"/>
+    <w:p>
+      <w:pPr>
+        <w:pStyle w:val="Heading3"/>
+      </w:pPr>
+      <w:r>
+        <w:t xml:space="preserve">Reflection task</w:t>
+      </w:r>
+    </w:p>
+    <w:p>
+      <w:pPr>
+        <w:pStyle w:val="FirstParagraph"/>
+      </w:pPr>
+      <w:r>
+        <w:t xml:space="preserve">Take some time to reflect on the group presentation following the structure below. Then write down your thoughts in 400–600 words and submit the reflection on Moodle by</w:t>
+      </w:r>
+      <w:r>
+        <w:t xml:space="preserve"> </w:t>
+      </w:r>
+      <w:r>
+        <w:rPr>
+          <w:b/>
+          <w:bCs/>
+        </w:rPr>
+        <w:t xml:space="preserve">December 18, 2026</w:t>
+      </w:r>
+      <w:r>
+        <w:t xml:space="preserve">.</w:t>
+      </w:r>
+    </w:p>
+    <w:p>
+      <w:pPr>
+        <w:pStyle w:val="BodyText"/>
+      </w:pPr>
+      <w:r>
+        <w:t xml:space="preserve">In the reflection task, please do the following:</w:t>
+      </w:r>
+    </w:p>
+    <w:p>
+      <w:pPr>
+        <w:pStyle w:val="Compact"/>
+        <w:numPr>
+          <w:ilvl w:val="0"/>
+          <w:numId w:val="1006"/>
+        </w:numPr>
+      </w:pPr>
+      <w:r>
+        <w:t xml:space="preserve">Describe how your group selected the communication example.</w:t>
+      </w:r>
+    </w:p>
+    <w:p>
+      <w:pPr>
+        <w:pStyle w:val="Compact"/>
+        <w:numPr>
+          <w:ilvl w:val="0"/>
+          <w:numId w:val="1006"/>
+        </w:numPr>
+      </w:pPr>
+      <w:r>
+        <w:t xml:space="preserve">Clearly state your role in the project and your overall contribution to the group project.</w:t>
+      </w:r>
+    </w:p>
+    <w:p>
+      <w:pPr>
+        <w:pStyle w:val="Compact"/>
+        <w:numPr>
+          <w:ilvl w:val="0"/>
+          <w:numId w:val="1006"/>
+        </w:numPr>
+      </w:pPr>
+      <w:r>
+        <w:t xml:space="preserve">Describe the group dynamics (e.g., Were there any conflicts? How did you manage the organization, prepare for the presentation, and decide on whether to use AI?). Is there anything you would do differently in hindsight?</w:t>
+      </w:r>
+    </w:p>
+    <w:p>
+      <w:pPr>
+        <w:pStyle w:val="Compact"/>
+        <w:numPr>
+          <w:ilvl w:val="0"/>
+          <w:numId w:val="1006"/>
+        </w:numPr>
+      </w:pPr>
+      <w:r>
+        <w:t xml:space="preserve">Reflect on your own contribution. Are you happy with your contribution/performance? Would you have liked to do more/less?</w:t>
+      </w:r>
+    </w:p>
+    <w:p>
+      <w:pPr>
+        <w:pStyle w:val="Compact"/>
+        <w:numPr>
+          <w:ilvl w:val="0"/>
+          <w:numId w:val="1006"/>
+        </w:numPr>
+      </w:pPr>
+      <w:r>
+        <w:t xml:space="preserve">Declare the use of AI in your group. If yes: How did you use it? Which model did you use? In which ways do you think using AI helped you? Do you think there are any downsides to the use of AI for your project?</w:t>
+      </w:r>
+    </w:p>
+    <w:bookmarkEnd w:id="33"/>
+    <w:bookmarkEnd w:id="34"/>
+    <w:bookmarkStart w:id="43" w:name="course-structure"/>
     <w:p>
       <w:pPr>
         <w:pStyle w:val="Heading2"/>
@@ -466,7 +747,7 @@
                 <w:b/>
                 <w:bCs/>
               </w:rPr>
-              <w:t xml:space="preserve">Introduction and organizational questions</w:t>
+              <w:t xml:space="preserve">Introduction and key concepts in environmental psychology</w:t>
             </w:r>
             <w:r>
               <w:t xml:space="preserve"> — Viktoria Cologna &amp; Jan Pfänder</w:t>
@@ -509,7 +790,7 @@
             <w:r>
               <w:t xml:space="preserve"> </w:t>
             </w:r>
-            <w:hyperlink r:id="rId33">
+            <w:hyperlink r:id="rId35">
               <w:r>
                 <w:rPr>
                   <w:rStyle w:val="Hyperlink"/>
@@ -554,7 +835,7 @@
                 <w:b/>
                 <w:bCs/>
               </w:rPr>
-              <w:t xml:space="preserve">Climate change, the deficit model, and public opinion</w:t>
+              <w:t xml:space="preserve">Public opinion on climate change and the deficit model</w:t>
             </w:r>
             <w:r>
               <w:t xml:space="preserve"> — Viktoria Cologna</w:t>
@@ -607,7 +888,7 @@
             <w:r>
               <w:t xml:space="preserve"> </w:t>
             </w:r>
-            <w:hyperlink r:id="rId34">
+            <w:hyperlink r:id="rId36">
               <w:r>
                 <w:rPr>
                   <w:rStyle w:val="Hyperlink"/>
@@ -616,30 +897,65 @@
               </w:r>
             </w:hyperlink>
           </w:p>
-          <w:p>
-            <w:pPr>
-              <w:pStyle w:val="BodyText"/>
-            </w:pPr>
-            <w:r>
-              <w:t xml:space="preserve">Leiserowitz et al. (2024). Climate Change in the American Mind: Beliefs &amp; Attitudes.</w:t>
-            </w:r>
-            <w:r>
-              <w:t xml:space="preserve"> </w:t>
-            </w:r>
+        </w:tc>
+      </w:tr>
+      <w:tr>
+        <w:tc>
+          <w:tcPr/>
+          <w:p>
+            <w:pPr>
+              <w:pStyle w:val="Compact"/>
+            </w:pPr>
+            <w:r>
+              <w:t xml:space="preserve">3</w:t>
+            </w:r>
+          </w:p>
+        </w:tc>
+        <w:tc>
+          <w:tcPr/>
+          <w:p>
+            <w:pPr>
+              <w:pStyle w:val="Compact"/>
+            </w:pPr>
+            <w:r>
+              <w:t xml:space="preserve">29.09.2026</w:t>
+            </w:r>
+          </w:p>
+        </w:tc>
+        <w:tc>
+          <w:tcPr/>
+          <w:p>
+            <w:pPr>
+              <w:pStyle w:val="BodyText"/>
+            </w:pPr>
             <w:r>
               <w:rPr>
                 <w:b/>
                 <w:bCs/>
               </w:rPr>
-              <w:t xml:space="preserve">[TODO: full citation missing from template’s reference list]</w:t>
-            </w:r>
-          </w:p>
-          <w:p>
-            <w:pPr>
-              <w:pStyle w:val="BodyText"/>
-            </w:pPr>
-            <w:r>
-              <w:t xml:space="preserve">Shi, J., Visschers, V. H. M., Siegrist, M., &amp; Arvai, J. (2016). Knowledge as a driver of public perceptions about climate change reassessed.</w:t>
+              <w:t xml:space="preserve">A question of trust</w:t>
+            </w:r>
+            <w:r>
+              <w:t xml:space="preserve"> — Viktoria Cologna</w:t>
+            </w:r>
+          </w:p>
+          <w:p>
+            <w:pPr>
+              <w:pStyle w:val="BodyText"/>
+            </w:pPr>
+            <w:r>
+              <w:t xml:space="preserve">Which actors are the most trusted sources of information about climate change? How can we maintain and potentially increase trust in climate change communicators? What is the role of climate scientists in communicating and engaging on the topic?</w:t>
+            </w:r>
+          </w:p>
+        </w:tc>
+        <w:tc>
+          <w:tcPr/>
+          <w:p>
+            <w:pPr>
+              <w:pStyle w:val="BodyText"/>
+            </w:pPr>
+            <w:r>
+              <w:t xml:space="preserve">Cologna, V., Kotcher, J., Mede, N. G., Besley, J., Maibach, E. W., &amp; Oreskes, N. (2024). Trust in climate science and climate scientists: A narrative review.</w:t>
             </w:r>
             <w:r>
               <w:t xml:space="preserve"> </w:t>
@@ -649,7 +965,7 @@
                 <w:i/>
                 <w:iCs/>
               </w:rPr>
-              <w:t xml:space="preserve">Nature Climate Change</w:t>
+              <w:t xml:space="preserve">PLOS Climate</w:t>
             </w:r>
             <w:r>
               <w:t xml:space="preserve">,</w:t>
@@ -662,20 +978,20 @@
                 <w:i/>
                 <w:iCs/>
               </w:rPr>
-              <w:t xml:space="preserve">6</w:t>
-            </w:r>
-            <w:r>
-              <w:t xml:space="preserve">(8).</w:t>
+              <w:t xml:space="preserve">3</w:t>
+            </w:r>
+            <w:r>
+              <w:t xml:space="preserve">(5), e0000400.</w:t>
             </w:r>
             <w:r>
               <w:t xml:space="preserve"> </w:t>
             </w:r>
-            <w:hyperlink r:id="rId35">
+            <w:hyperlink r:id="rId37">
               <w:r>
                 <w:rPr>
                   <w:rStyle w:val="Hyperlink"/>
                 </w:rPr>
-                <w:t xml:space="preserve">https://doi.org/10.1038/nclimate2997</w:t>
+                <w:t xml:space="preserve">https://doi.org/10.1371/journal.pclm.0000400</w:t>
               </w:r>
             </w:hyperlink>
           </w:p>
@@ -689,7 +1005,7 @@
               <w:pStyle w:val="Compact"/>
             </w:pPr>
             <w:r>
-              <w:t xml:space="preserve">3</w:t>
+              <w:t xml:space="preserve">4</w:t>
             </w:r>
           </w:p>
         </w:tc>
@@ -700,7 +1016,117 @@
               <w:pStyle w:val="Compact"/>
             </w:pPr>
             <w:r>
-              <w:t xml:space="preserve">29.09.2026</w:t>
+              <w:t xml:space="preserve">06.10.2026</w:t>
+            </w:r>
+          </w:p>
+        </w:tc>
+        <w:tc>
+          <w:tcPr/>
+          <w:p>
+            <w:pPr>
+              <w:pStyle w:val="BodyText"/>
+            </w:pPr>
+            <w:r>
+              <w:rPr>
+                <w:b/>
+                <w:bCs/>
+              </w:rPr>
+              <w:t xml:space="preserve">Mental models and framing</w:t>
+            </w:r>
+            <w:r>
+              <w:t xml:space="preserve"> — Jan Pfänder</w:t>
+            </w:r>
+          </w:p>
+          <w:p>
+            <w:pPr>
+              <w:pStyle w:val="BodyText"/>
+            </w:pPr>
+            <w:r>
+              <w:t xml:space="preserve">What are mental models? Which frames are used in climate change communication? How can we frame climate change in a way that allows us to reach different population groups? What are the strategies, channels, and messages used by different stakeholders?</w:t>
+            </w:r>
+          </w:p>
+        </w:tc>
+        <w:tc>
+          <w:tcPr/>
+          <w:p>
+            <w:pPr>
+              <w:pStyle w:val="BodyText"/>
+            </w:pPr>
+            <w:r>
+              <w:t xml:space="preserve">van der Linden, S., Maibach, E., &amp; Leiserowitz, A. (2015). Improving Public Engagement With Climate Change: Five</w:t>
+            </w:r>
+            <w:r>
+              <w:t xml:space="preserve"> </w:t>
+            </w:r>
+            <w:r>
+              <w:t xml:space="preserve">“Best Practice”</w:t>
+            </w:r>
+            <w:r>
+              <w:t xml:space="preserve"> </w:t>
+            </w:r>
+            <w:r>
+              <w:t xml:space="preserve">Insights From Psychological Science.</w:t>
+            </w:r>
+            <w:r>
+              <w:t xml:space="preserve"> </w:t>
+            </w:r>
+            <w:r>
+              <w:rPr>
+                <w:i/>
+                <w:iCs/>
+              </w:rPr>
+              <w:t xml:space="preserve">Perspectives on Psychological Science</w:t>
+            </w:r>
+            <w:r>
+              <w:t xml:space="preserve">,</w:t>
+            </w:r>
+            <w:r>
+              <w:t xml:space="preserve"> </w:t>
+            </w:r>
+            <w:r>
+              <w:rPr>
+                <w:i/>
+                <w:iCs/>
+              </w:rPr>
+              <w:t xml:space="preserve">10</w:t>
+            </w:r>
+            <w:r>
+              <w:t xml:space="preserve">(6), 758-763.</w:t>
+            </w:r>
+            <w:r>
+              <w:t xml:space="preserve"> </w:t>
+            </w:r>
+            <w:hyperlink r:id="rId38">
+              <w:r>
+                <w:rPr>
+                  <w:rStyle w:val="Hyperlink"/>
+                </w:rPr>
+                <w:t xml:space="preserve">https://doi.org/10.1177/1745691615598516</w:t>
+              </w:r>
+            </w:hyperlink>
+          </w:p>
+        </w:tc>
+      </w:tr>
+      <w:tr>
+        <w:tc>
+          <w:tcPr/>
+          <w:p>
+            <w:pPr>
+              <w:pStyle w:val="Compact"/>
+            </w:pPr>
+            <w:r>
+              <w:t xml:space="preserve">5</w:t>
+            </w:r>
+          </w:p>
+        </w:tc>
+        <w:tc>
+          <w:tcPr/>
+          <w:p>
+            <w:pPr>
+              <w:pStyle w:val="Compact"/>
+            </w:pPr>
+            <w:r>
+              <w:t xml:space="preserve">13.10.2026</w:t>
             </w:r>
           </w:p>
         </w:tc>
@@ -726,102 +1152,12 @@
               <w:pStyle w:val="BodyText"/>
             </w:pPr>
             <w:r>
-              <w:t xml:space="preserve">What is the role of emotions in climate change communication? How can we communicate about climate change in a way that increases feelings of self-efficacy? How does media usage relate to behavioral intentions?</w:t>
-            </w:r>
-          </w:p>
-        </w:tc>
-        <w:tc>
-          <w:tcPr/>
-          <w:p>
-            <w:pPr>
-              <w:pStyle w:val="BodyText"/>
-            </w:pPr>
-            <w:r>
-              <w:t xml:space="preserve">Myers, T. A., Roser-Renouf, C., &amp; Maibach, E. (2023). Emotional responses to climate change information and their effects on policy support.</w:t>
-            </w:r>
-            <w:r>
-              <w:t xml:space="preserve"> </w:t>
-            </w:r>
-            <w:r>
-              <w:rPr>
-                <w:i/>
-                <w:iCs/>
-              </w:rPr>
-              <w:t xml:space="preserve">Frontiers in Climate</w:t>
-            </w:r>
-            <w:r>
-              <w:t xml:space="preserve">,</w:t>
-            </w:r>
-            <w:r>
-              <w:t xml:space="preserve"> </w:t>
-            </w:r>
-            <w:r>
-              <w:rPr>
-                <w:i/>
-                <w:iCs/>
-              </w:rPr>
-              <w:t xml:space="preserve">5</w:t>
-            </w:r>
-            <w:r>
-              <w:t xml:space="preserve">.</w:t>
-            </w:r>
-            <w:r>
-              <w:t xml:space="preserve"> </w:t>
-            </w:r>
-            <w:hyperlink r:id="rId36">
-              <w:r>
-                <w:rPr>
-                  <w:rStyle w:val="Hyperlink"/>
-                </w:rPr>
-                <w:t xml:space="preserve">https://www.frontiersin.org/articles/10.3389/fclim.2023.1135450</w:t>
-              </w:r>
-            </w:hyperlink>
-          </w:p>
-          <w:p>
-            <w:pPr>
-              <w:pStyle w:val="BodyText"/>
-            </w:pPr>
-            <w:r>
-              <w:t xml:space="preserve">Ogunbode, C. A., Doran, R., Hanss, D., Ojala, M., Salmela-Aro, K., van den Broek, K. L., Bhullar, N., Aquino, S. D., Marot, T., Schermer, J. A., Wlodarczyk, A., Lu, S., Jiang, F., Maran, D. A., Yadav, R., Ardi, R., Chegeni, R., Ghanbarian, E., Zand, S., … Karasu, M. (2022). Climate anxiety, wellbeing and pro-environmental action: Correlates of negative emotional responses to climate change in 32 countries.</w:t>
-            </w:r>
-            <w:r>
-              <w:t xml:space="preserve"> </w:t>
-            </w:r>
-            <w:r>
-              <w:rPr>
-                <w:i/>
-                <w:iCs/>
-              </w:rPr>
-              <w:t xml:space="preserve">Journal of Environmental Psychology</w:t>
-            </w:r>
-            <w:r>
-              <w:t xml:space="preserve">,</w:t>
-            </w:r>
-            <w:r>
-              <w:t xml:space="preserve"> </w:t>
-            </w:r>
-            <w:r>
-              <w:rPr>
-                <w:i/>
-                <w:iCs/>
-              </w:rPr>
-              <w:t xml:space="preserve">84</w:t>
-            </w:r>
-            <w:r>
-              <w:t xml:space="preserve">, 101887.</w:t>
-            </w:r>
-            <w:r>
-              <w:t xml:space="preserve"> </w:t>
-            </w:r>
-            <w:hyperlink r:id="rId37">
-              <w:r>
-                <w:rPr>
-                  <w:rStyle w:val="Hyperlink"/>
-                </w:rPr>
-                <w:t xml:space="preserve">https://doi.org/10.1016/j.jenvp.2022.101887</w:t>
-              </w:r>
-            </w:hyperlink>
-          </w:p>
+              <w:t xml:space="preserve">What is the role of emotions in climate change communication? How can we communicate about climate change in a way that increases feelings of self-efficacy? How does media usage relate to behavioral intentions? Group presentations start this week.</w:t>
+            </w:r>
+          </w:p>
+        </w:tc>
+        <w:tc>
+          <w:tcPr/>
           <w:p>
             <w:pPr>
               <w:pStyle w:val="BodyText"/>
@@ -858,7 +1194,7 @@
             <w:r>
               <w:t xml:space="preserve"> </w:t>
             </w:r>
-            <w:hyperlink r:id="rId38">
+            <w:hyperlink r:id="rId39">
               <w:r>
                 <w:rPr>
                   <w:rStyle w:val="Hyperlink"/>
@@ -877,337 +1213,6 @@
               <w:pStyle w:val="Compact"/>
             </w:pPr>
             <w:r>
-              <w:t xml:space="preserve">4</w:t>
-            </w:r>
-          </w:p>
-        </w:tc>
-        <w:tc>
-          <w:tcPr/>
-          <w:p>
-            <w:pPr>
-              <w:pStyle w:val="Compact"/>
-            </w:pPr>
-            <w:r>
-              <w:t xml:space="preserve">06.10.2026</w:t>
-            </w:r>
-          </w:p>
-        </w:tc>
-        <w:tc>
-          <w:tcPr/>
-          <w:p>
-            <w:pPr>
-              <w:pStyle w:val="BodyText"/>
-            </w:pPr>
-            <w:r>
-              <w:rPr>
-                <w:b/>
-                <w:bCs/>
-              </w:rPr>
-              <w:t xml:space="preserve">Mental models and framing</w:t>
-            </w:r>
-            <w:r>
-              <w:t xml:space="preserve"> — Jan Pfänder</w:t>
-            </w:r>
-          </w:p>
-          <w:p>
-            <w:pPr>
-              <w:pStyle w:val="BodyText"/>
-            </w:pPr>
-            <w:r>
-              <w:t xml:space="preserve">What are mental models? Which frames are used in climate change communication? How can we frame climate change in a way that allows us to reach different population groups? What are the strategies, channels, and messages used by different stakeholders?</w:t>
-            </w:r>
-          </w:p>
-        </w:tc>
-        <w:tc>
-          <w:tcPr/>
-          <w:p>
-            <w:pPr>
-              <w:pStyle w:val="BodyText"/>
-            </w:pPr>
-            <w:r>
-              <w:t xml:space="preserve">Lakoff, G. (2010). Why it Matters How We Frame the Environment.</w:t>
-            </w:r>
-            <w:r>
-              <w:t xml:space="preserve"> </w:t>
-            </w:r>
-            <w:r>
-              <w:rPr>
-                <w:i/>
-                <w:iCs/>
-              </w:rPr>
-              <w:t xml:space="preserve">Environmental Communication</w:t>
-            </w:r>
-            <w:r>
-              <w:t xml:space="preserve">,</w:t>
-            </w:r>
-            <w:r>
-              <w:t xml:space="preserve"> </w:t>
-            </w:r>
-            <w:r>
-              <w:rPr>
-                <w:i/>
-                <w:iCs/>
-              </w:rPr>
-              <w:t xml:space="preserve">4</w:t>
-            </w:r>
-            <w:r>
-              <w:t xml:space="preserve">(1), 70–81.</w:t>
-            </w:r>
-            <w:r>
-              <w:t xml:space="preserve"> </w:t>
-            </w:r>
-            <w:hyperlink r:id="rId39">
-              <w:r>
-                <w:rPr>
-                  <w:rStyle w:val="Hyperlink"/>
-                </w:rPr>
-                <w:t xml:space="preserve">https://doi.org/10.1080/17524030903529749</w:t>
-              </w:r>
-            </w:hyperlink>
-          </w:p>
-          <w:p>
-            <w:pPr>
-              <w:pStyle w:val="BodyText"/>
-            </w:pPr>
-            <w:r>
-              <w:t xml:space="preserve">Dasandi, N., Graham, H., Hudson, D., Jankin, S., vanHeerde-Hudson, J., &amp; Watts, N. (2022). Positive, global, and health or environment framing bolsters public support for climate policies.</w:t>
-            </w:r>
-            <w:r>
-              <w:t xml:space="preserve"> </w:t>
-            </w:r>
-            <w:r>
-              <w:rPr>
-                <w:i/>
-                <w:iCs/>
-              </w:rPr>
-              <w:t xml:space="preserve">Communications Earth &amp; Environment</w:t>
-            </w:r>
-            <w:r>
-              <w:t xml:space="preserve">,</w:t>
-            </w:r>
-            <w:r>
-              <w:t xml:space="preserve"> </w:t>
-            </w:r>
-            <w:r>
-              <w:rPr>
-                <w:i/>
-                <w:iCs/>
-              </w:rPr>
-              <w:t xml:space="preserve">3</w:t>
-            </w:r>
-            <w:r>
-              <w:t xml:space="preserve">(1), 239.</w:t>
-            </w:r>
-            <w:r>
-              <w:t xml:space="preserve"> </w:t>
-            </w:r>
-            <w:hyperlink r:id="rId40">
-              <w:r>
-                <w:rPr>
-                  <w:rStyle w:val="Hyperlink"/>
-                </w:rPr>
-                <w:t xml:space="preserve">https://doi.org/10.1038/s43247-022-00571-x</w:t>
-              </w:r>
-            </w:hyperlink>
-          </w:p>
-          <w:p>
-            <w:pPr>
-              <w:pStyle w:val="BodyText"/>
-            </w:pPr>
-            <w:r>
-              <w:t xml:space="preserve">Supran, G., &amp; Oreskes, N. (2021). Rhetoric and frame analysis of ExxonMobil’s climate change communications.</w:t>
-            </w:r>
-            <w:r>
-              <w:t xml:space="preserve"> </w:t>
-            </w:r>
-            <w:r>
-              <w:rPr>
-                <w:i/>
-                <w:iCs/>
-              </w:rPr>
-              <w:t xml:space="preserve">One Earth</w:t>
-            </w:r>
-            <w:r>
-              <w:t xml:space="preserve">,</w:t>
-            </w:r>
-            <w:r>
-              <w:t xml:space="preserve"> </w:t>
-            </w:r>
-            <w:r>
-              <w:rPr>
-                <w:i/>
-                <w:iCs/>
-              </w:rPr>
-              <w:t xml:space="preserve">4</w:t>
-            </w:r>
-            <w:r>
-              <w:t xml:space="preserve">(5), 696–719.</w:t>
-            </w:r>
-            <w:r>
-              <w:t xml:space="preserve"> </w:t>
-            </w:r>
-            <w:hyperlink r:id="rId41">
-              <w:r>
-                <w:rPr>
-                  <w:rStyle w:val="Hyperlink"/>
-                </w:rPr>
-                <w:t xml:space="preserve">https://doi.org/10.1016/j.oneear.2021.04.014</w:t>
-              </w:r>
-            </w:hyperlink>
-          </w:p>
-        </w:tc>
-      </w:tr>
-      <w:tr>
-        <w:tc>
-          <w:tcPr/>
-          <w:p>
-            <w:pPr>
-              <w:pStyle w:val="Compact"/>
-            </w:pPr>
-            <w:r>
-              <w:t xml:space="preserve">5</w:t>
-            </w:r>
-          </w:p>
-        </w:tc>
-        <w:tc>
-          <w:tcPr/>
-          <w:p>
-            <w:pPr>
-              <w:pStyle w:val="Compact"/>
-            </w:pPr>
-            <w:r>
-              <w:t xml:space="preserve">13.10.2026</w:t>
-            </w:r>
-          </w:p>
-        </w:tc>
-        <w:tc>
-          <w:tcPr/>
-          <w:p>
-            <w:pPr>
-              <w:pStyle w:val="BodyText"/>
-            </w:pPr>
-            <w:r>
-              <w:rPr>
-                <w:b/>
-                <w:bCs/>
-              </w:rPr>
-              <w:t xml:space="preserve">A question of trust</w:t>
-            </w:r>
-            <w:r>
-              <w:t xml:space="preserve"> — Viktoria Cologna</w:t>
-            </w:r>
-          </w:p>
-          <w:p>
-            <w:pPr>
-              <w:pStyle w:val="BodyText"/>
-            </w:pPr>
-            <w:r>
-              <w:t xml:space="preserve">Which actors are the most trusted sources of information about climate change? How can we maintain and potentially increase trust in climate change communicators? What is the role of climate scientists in communicating and engaging on the topic?</w:t>
-            </w:r>
-          </w:p>
-        </w:tc>
-        <w:tc>
-          <w:tcPr/>
-          <w:p>
-            <w:pPr>
-              <w:pStyle w:val="BodyText"/>
-            </w:pPr>
-            <w:r>
-              <w:t xml:space="preserve">Cologna, V., Kotcher, J., Mede, N. G., Besley, J., Maibach, E. W., &amp; Oreskes, N. (2024). Trust in climate science and climate scientists: A narrative review.</w:t>
-            </w:r>
-            <w:r>
-              <w:t xml:space="preserve"> </w:t>
-            </w:r>
-            <w:r>
-              <w:rPr>
-                <w:i/>
-                <w:iCs/>
-              </w:rPr>
-              <w:t xml:space="preserve">PLOS Climate</w:t>
-            </w:r>
-            <w:r>
-              <w:t xml:space="preserve">,</w:t>
-            </w:r>
-            <w:r>
-              <w:t xml:space="preserve"> </w:t>
-            </w:r>
-            <w:r>
-              <w:rPr>
-                <w:i/>
-                <w:iCs/>
-              </w:rPr>
-              <w:t xml:space="preserve">3</w:t>
-            </w:r>
-            <w:r>
-              <w:t xml:space="preserve">(5), e0000400.</w:t>
-            </w:r>
-            <w:r>
-              <w:t xml:space="preserve"> </w:t>
-            </w:r>
-            <w:hyperlink r:id="rId42">
-              <w:r>
-                <w:rPr>
-                  <w:rStyle w:val="Hyperlink"/>
-                </w:rPr>
-                <w:t xml:space="preserve">https://doi.org/10.1371/journal.pclm.0000400</w:t>
-              </w:r>
-            </w:hyperlink>
-          </w:p>
-          <w:p>
-            <w:pPr>
-              <w:pStyle w:val="BodyText"/>
-            </w:pPr>
-            <w:r>
-              <w:t xml:space="preserve">Oreskes, N. (2020). What Is the Social Responsibility of Climate Scientists?</w:t>
-            </w:r>
-            <w:r>
-              <w:t xml:space="preserve"> </w:t>
-            </w:r>
-            <w:r>
-              <w:rPr>
-                <w:i/>
-                <w:iCs/>
-              </w:rPr>
-              <w:t xml:space="preserve">Daedalus</w:t>
-            </w:r>
-            <w:r>
-              <w:t xml:space="preserve">,</w:t>
-            </w:r>
-            <w:r>
-              <w:t xml:space="preserve"> </w:t>
-            </w:r>
-            <w:r>
-              <w:rPr>
-                <w:i/>
-                <w:iCs/>
-              </w:rPr>
-              <w:t xml:space="preserve">149</w:t>
-            </w:r>
-            <w:r>
-              <w:t xml:space="preserve">(4), 33–45.</w:t>
-            </w:r>
-            <w:r>
-              <w:t xml:space="preserve"> </w:t>
-            </w:r>
-            <w:hyperlink r:id="rId43">
-              <w:r>
-                <w:rPr>
-                  <w:rStyle w:val="Hyperlink"/>
-                </w:rPr>
-                <w:t xml:space="preserve">https://doi.org/10.1162/daed_a_01815</w:t>
-              </w:r>
-            </w:hyperlink>
-          </w:p>
-        </w:tc>
-      </w:tr>
-      <w:tr>
-        <w:tc>
-          <w:tcPr/>
-          <w:p>
-            <w:pPr>
-              <w:pStyle w:val="Compact"/>
-            </w:pPr>
-            <w:r>
               <w:t xml:space="preserve">6</w:t>
             </w:r>
           </w:p>
@@ -1360,7 +1365,7 @@
                 <w:b/>
                 <w:bCs/>
               </w:rPr>
-              <w:t xml:space="preserve">Climate change in news and social media</w:t>
+              <w:t xml:space="preserve">Climate change in the media</w:t>
             </w:r>
             <w:r>
               <w:t xml:space="preserve"> — Viktoria Cologna</w:t>
@@ -1413,7 +1418,7 @@
             <w:r>
               <w:t xml:space="preserve"> </w:t>
             </w:r>
-            <w:hyperlink r:id="rId44">
+            <w:hyperlink r:id="rId40">
               <w:r>
                 <w:rPr>
                   <w:rStyle w:val="Hyperlink"/>
@@ -1422,162 +1427,6 @@
               </w:r>
             </w:hyperlink>
           </w:p>
-          <w:p>
-            <w:pPr>
-              <w:pStyle w:val="BodyText"/>
-            </w:pPr>
-            <w:r>
-              <w:t xml:space="preserve">O’Neill, S. J. (2013). Image matters: Climate change imagery in US, UK and Australian newspapers.</w:t>
-            </w:r>
-            <w:r>
-              <w:t xml:space="preserve"> </w:t>
-            </w:r>
-            <w:r>
-              <w:rPr>
-                <w:i/>
-                <w:iCs/>
-              </w:rPr>
-              <w:t xml:space="preserve">Geoforum</w:t>
-            </w:r>
-            <w:r>
-              <w:t xml:space="preserve">,</w:t>
-            </w:r>
-            <w:r>
-              <w:t xml:space="preserve"> </w:t>
-            </w:r>
-            <w:r>
-              <w:rPr>
-                <w:i/>
-                <w:iCs/>
-              </w:rPr>
-              <w:t xml:space="preserve">49</w:t>
-            </w:r>
-            <w:r>
-              <w:t xml:space="preserve">, 10–19.</w:t>
-            </w:r>
-            <w:r>
-              <w:t xml:space="preserve"> </w:t>
-            </w:r>
-            <w:hyperlink r:id="rId45">
-              <w:r>
-                <w:rPr>
-                  <w:rStyle w:val="Hyperlink"/>
-                </w:rPr>
-                <w:t xml:space="preserve">https://doi.org/10.1016/j.geoforum.2013.04.030</w:t>
-              </w:r>
-            </w:hyperlink>
-          </w:p>
-          <w:p>
-            <w:pPr>
-              <w:pStyle w:val="BodyText"/>
-            </w:pPr>
-            <w:r>
-              <w:t xml:space="preserve">Barkemeyer, R., Figge, F., Hoepner, A., Holt, D., Kraak, J. M., &amp; Yu, P.-S. (2017). Media coverage of climate change: An international comparison.</w:t>
-            </w:r>
-            <w:r>
-              <w:t xml:space="preserve"> </w:t>
-            </w:r>
-            <w:r>
-              <w:rPr>
-                <w:i/>
-                <w:iCs/>
-              </w:rPr>
-              <w:t xml:space="preserve">Environment and Planning C: Politics and Space</w:t>
-            </w:r>
-            <w:r>
-              <w:t xml:space="preserve">,</w:t>
-            </w:r>
-            <w:r>
-              <w:t xml:space="preserve"> </w:t>
-            </w:r>
-            <w:r>
-              <w:rPr>
-                <w:i/>
-                <w:iCs/>
-              </w:rPr>
-              <w:t xml:space="preserve">35</w:t>
-            </w:r>
-            <w:r>
-              <w:t xml:space="preserve">(6), 1029–1054.</w:t>
-            </w:r>
-            <w:r>
-              <w:t xml:space="preserve"> </w:t>
-            </w:r>
-            <w:hyperlink r:id="rId46">
-              <w:r>
-                <w:rPr>
-                  <w:rStyle w:val="Hyperlink"/>
-                </w:rPr>
-                <w:t xml:space="preserve">https://doi.org/10.1177/0263774X16680818</w:t>
-              </w:r>
-            </w:hyperlink>
-          </w:p>
-          <w:p>
-            <w:pPr>
-              <w:pStyle w:val="BodyText"/>
-            </w:pPr>
-            <w:r>
-              <w:t xml:space="preserve">Klinger, K., &amp; Metag, J. (2021). Media Effects in the Context of Environmental Issues. In</w:t>
-            </w:r>
-            <w:r>
-              <w:t xml:space="preserve"> </w:t>
-            </w:r>
-            <w:r>
-              <w:rPr>
-                <w:i/>
-                <w:iCs/>
-              </w:rPr>
-              <w:t xml:space="preserve">The Handbook of International Trends in Environmental Communication</w:t>
-            </w:r>
-            <w:r>
-              <w:t xml:space="preserve">. Routledge.</w:t>
-            </w:r>
-          </w:p>
-          <w:p>
-            <w:pPr>
-              <w:pStyle w:val="BodyText"/>
-            </w:pPr>
-            <w:r>
-              <w:t xml:space="preserve">Schäfer, M. S., &amp; Painter, J. (2021). Climate journalism in a changing media ecosystem: Assessing the production of climate change-related news around the world.</w:t>
-            </w:r>
-            <w:r>
-              <w:t xml:space="preserve"> </w:t>
-            </w:r>
-            <w:r>
-              <w:rPr>
-                <w:i/>
-                <w:iCs/>
-              </w:rPr>
-              <w:t xml:space="preserve">WIREs Climate Change</w:t>
-            </w:r>
-            <w:r>
-              <w:t xml:space="preserve">,</w:t>
-            </w:r>
-            <w:r>
-              <w:t xml:space="preserve"> </w:t>
-            </w:r>
-            <w:r>
-              <w:rPr>
-                <w:i/>
-                <w:iCs/>
-              </w:rPr>
-              <w:t xml:space="preserve">12</w:t>
-            </w:r>
-            <w:r>
-              <w:t xml:space="preserve">(1), e675.</w:t>
-            </w:r>
-            <w:r>
-              <w:t xml:space="preserve"> </w:t>
-            </w:r>
-            <w:hyperlink r:id="rId47">
-              <w:r>
-                <w:rPr>
-                  <w:rStyle w:val="Hyperlink"/>
-                </w:rPr>
-                <w:t xml:space="preserve">https://doi.org/10.1002/wcc.675</w:t>
-              </w:r>
-            </w:hyperlink>
-          </w:p>
         </w:tc>
       </w:tr>
       <w:tr>
@@ -1636,8 +1485,45 @@
               <w:pStyle w:val="BodyText"/>
             </w:pPr>
             <w:r>
-              <w:t xml:space="preserve">tbd</w:t>
-            </w:r>
+              <w:t xml:space="preserve">Lewandowsky, S. (2021). Climate Change Disinformation and How to Combat It.</w:t>
+            </w:r>
+            <w:r>
+              <w:t xml:space="preserve"> </w:t>
+            </w:r>
+            <w:r>
+              <w:rPr>
+                <w:i/>
+                <w:iCs/>
+              </w:rPr>
+              <w:t xml:space="preserve">Annual Review of Public Health</w:t>
+            </w:r>
+            <w:r>
+              <w:t xml:space="preserve">,</w:t>
+            </w:r>
+            <w:r>
+              <w:t xml:space="preserve"> </w:t>
+            </w:r>
+            <w:r>
+              <w:rPr>
+                <w:i/>
+                <w:iCs/>
+              </w:rPr>
+              <w:t xml:space="preserve">42</w:t>
+            </w:r>
+            <w:r>
+              <w:t xml:space="preserve">(1), 1-21.</w:t>
+            </w:r>
+            <w:r>
+              <w:t xml:space="preserve"> </w:t>
+            </w:r>
+            <w:hyperlink r:id="rId41">
+              <w:r>
+                <w:rPr>
+                  <w:rStyle w:val="Hyperlink"/>
+                </w:rPr>
+                <w:t xml:space="preserve">https://doi.org/10.1146/annurev-publhealth-090419-102409</w:t>
+              </w:r>
+            </w:hyperlink>
           </w:p>
         </w:tc>
       </w:tr>
@@ -1686,6 +1572,169 @@
               <w:pStyle w:val="BodyText"/>
             </w:pPr>
             <w:r>
+              <w:t xml:space="preserve">Dr. Leonard Creutzburg co-leads the WWF Switzerland One Planet Lab, where he is a project lead for new economic systems. He was a research assistant at ETH Zurich at the Natural Research Policy Group (NARP) and completed his PhD in Economic Geography at the University of Zurich. He will talk to us about the challenges of climate communication from the perspective of a Swiss NGO.</w:t>
+            </w:r>
+          </w:p>
+        </w:tc>
+        <w:tc>
+          <w:tcPr/>
+          <w:p>
+            <w:pPr>
+              <w:pStyle w:val="BodyText"/>
+            </w:pPr>
+            <w:r>
+              <w:t xml:space="preserve">Preparation: Come to class with at least 3 questions for our guest speaker.</w:t>
+            </w:r>
+          </w:p>
+        </w:tc>
+      </w:tr>
+      <w:tr>
+        <w:tc>
+          <w:tcPr/>
+          <w:p>
+            <w:pPr>
+              <w:pStyle w:val="Compact"/>
+            </w:pPr>
+            <w:r>
+              <w:t xml:space="preserve">11</w:t>
+            </w:r>
+          </w:p>
+        </w:tc>
+        <w:tc>
+          <w:tcPr/>
+          <w:p>
+            <w:pPr>
+              <w:pStyle w:val="Compact"/>
+            </w:pPr>
+            <w:r>
+              <w:t xml:space="preserve">24.11.2026</w:t>
+            </w:r>
+          </w:p>
+        </w:tc>
+        <w:tc>
+          <w:tcPr/>
+          <w:p>
+            <w:pPr>
+              <w:pStyle w:val="BodyText"/>
+            </w:pPr>
+            <w:r>
+              <w:rPr>
+                <w:b/>
+                <w:bCs/>
+              </w:rPr>
+              <w:t xml:space="preserve">From communication to behavior change</w:t>
+            </w:r>
+            <w:r>
+              <w:t xml:space="preserve"> — Jan Pfänder</w:t>
+            </w:r>
+          </w:p>
+          <w:p>
+            <w:pPr>
+              <w:pStyle w:val="BodyText"/>
+            </w:pPr>
+            <w:r>
+              <w:rPr>
+                <w:b/>
+                <w:bCs/>
+              </w:rPr>
+              <w:t xml:space="preserve">[TODO: description]</w:t>
+            </w:r>
+          </w:p>
+        </w:tc>
+        <w:tc>
+          <w:tcPr/>
+          <w:p>
+            <w:pPr>
+              <w:pStyle w:val="BodyText"/>
+            </w:pPr>
+            <w:r>
+              <w:t xml:space="preserve">Fielding, K.S., &amp; Hornsey, M.J. (2026). Understanding and reducing the intention–behaviour gap in climate action.</w:t>
+            </w:r>
+            <w:r>
+              <w:t xml:space="preserve"> </w:t>
+            </w:r>
+            <w:r>
+              <w:rPr>
+                <w:i/>
+                <w:iCs/>
+              </w:rPr>
+              <w:t xml:space="preserve">Nature Climate Change</w:t>
+            </w:r>
+            <w:r>
+              <w:t xml:space="preserve">,</w:t>
+            </w:r>
+            <w:r>
+              <w:t xml:space="preserve"> </w:t>
+            </w:r>
+            <w:r>
+              <w:rPr>
+                <w:i/>
+                <w:iCs/>
+              </w:rPr>
+              <w:t xml:space="preserve">16</w:t>
+            </w:r>
+            <w:r>
+              <w:t xml:space="preserve">(6), 638-647.</w:t>
+            </w:r>
+            <w:r>
+              <w:t xml:space="preserve"> </w:t>
+            </w:r>
+            <w:hyperlink r:id="rId42">
+              <w:r>
+                <w:rPr>
+                  <w:rStyle w:val="Hyperlink"/>
+                </w:rPr>
+                <w:t xml:space="preserve">https://doi.org/10.1038/s41558-026-02630-z</w:t>
+              </w:r>
+            </w:hyperlink>
+          </w:p>
+        </w:tc>
+      </w:tr>
+      <w:tr>
+        <w:tc>
+          <w:tcPr/>
+          <w:p>
+            <w:pPr>
+              <w:pStyle w:val="Compact"/>
+            </w:pPr>
+            <w:r>
+              <w:t xml:space="preserve">12</w:t>
+            </w:r>
+          </w:p>
+        </w:tc>
+        <w:tc>
+          <w:tcPr/>
+          <w:p>
+            <w:pPr>
+              <w:pStyle w:val="Compact"/>
+            </w:pPr>
+            <w:r>
+              <w:t xml:space="preserve">01.12.2026</w:t>
+            </w:r>
+          </w:p>
+        </w:tc>
+        <w:tc>
+          <w:tcPr/>
+          <w:p>
+            <w:pPr>
+              <w:pStyle w:val="BodyText"/>
+            </w:pPr>
+            <w:r>
+              <w:rPr>
+                <w:b/>
+                <w:bCs/>
+              </w:rPr>
+              <w:t xml:space="preserve">Guest speaker: Dr. Cornelia Staub</w:t>
+            </w:r>
+            <w:r>
+              <w:t xml:space="preserve"> — Invited speaker</w:t>
+            </w:r>
+          </w:p>
+          <w:p>
+            <w:pPr>
+              <w:pStyle w:val="BodyText"/>
+            </w:pPr>
+            <w:r>
               <w:rPr>
                 <w:b/>
                 <w:bCs/>
@@ -1714,136 +1763,6 @@
               <w:pStyle w:val="Compact"/>
             </w:pPr>
             <w:r>
-              <w:t xml:space="preserve">11</w:t>
-            </w:r>
-          </w:p>
-        </w:tc>
-        <w:tc>
-          <w:tcPr/>
-          <w:p>
-            <w:pPr>
-              <w:pStyle w:val="Compact"/>
-            </w:pPr>
-            <w:r>
-              <w:t xml:space="preserve">24.11.2026</w:t>
-            </w:r>
-          </w:p>
-        </w:tc>
-        <w:tc>
-          <w:tcPr/>
-          <w:p>
-            <w:pPr>
-              <w:pStyle w:val="BodyText"/>
-            </w:pPr>
-            <w:r>
-              <w:rPr>
-                <w:b/>
-                <w:bCs/>
-              </w:rPr>
-              <w:t xml:space="preserve">TBD</w:t>
-            </w:r>
-            <w:r>
-              <w:t xml:space="preserve"> — Jan Pfänder</w:t>
-            </w:r>
-          </w:p>
-          <w:p>
-            <w:pPr>
-              <w:pStyle w:val="BodyText"/>
-            </w:pPr>
-            <w:r>
-              <w:rPr>
-                <w:b/>
-                <w:bCs/>
-              </w:rPr>
-              <w:t xml:space="preserve">[TODO: topic]</w:t>
-            </w:r>
-          </w:p>
-        </w:tc>
-        <w:tc>
-          <w:tcPr/>
-          <w:p>
-            <w:pPr>
-              <w:pStyle w:val="BodyText"/>
-            </w:pPr>
-            <w:r>
-              <w:t xml:space="preserve">tbd</w:t>
-            </w:r>
-          </w:p>
-        </w:tc>
-      </w:tr>
-      <w:tr>
-        <w:tc>
-          <w:tcPr/>
-          <w:p>
-            <w:pPr>
-              <w:pStyle w:val="Compact"/>
-            </w:pPr>
-            <w:r>
-              <w:t xml:space="preserve">12</w:t>
-            </w:r>
-          </w:p>
-        </w:tc>
-        <w:tc>
-          <w:tcPr/>
-          <w:p>
-            <w:pPr>
-              <w:pStyle w:val="Compact"/>
-            </w:pPr>
-            <w:r>
-              <w:t xml:space="preserve">01.12.2026</w:t>
-            </w:r>
-          </w:p>
-        </w:tc>
-        <w:tc>
-          <w:tcPr/>
-          <w:p>
-            <w:pPr>
-              <w:pStyle w:val="BodyText"/>
-            </w:pPr>
-            <w:r>
-              <w:rPr>
-                <w:b/>
-                <w:bCs/>
-              </w:rPr>
-              <w:t xml:space="preserve">Guest speaker: Dr. Cornelia Staub</w:t>
-            </w:r>
-            <w:r>
-              <w:t xml:space="preserve"> — Invited speaker</w:t>
-            </w:r>
-          </w:p>
-          <w:p>
-            <w:pPr>
-              <w:pStyle w:val="BodyText"/>
-            </w:pPr>
-            <w:r>
-              <w:rPr>
-                <w:b/>
-                <w:bCs/>
-              </w:rPr>
-              <w:t xml:space="preserve">[TODO: speaker blurb]</w:t>
-            </w:r>
-          </w:p>
-        </w:tc>
-        <w:tc>
-          <w:tcPr/>
-          <w:p>
-            <w:pPr>
-              <w:pStyle w:val="BodyText"/>
-            </w:pPr>
-            <w:r>
-              <w:t xml:space="preserve">Preparation: Come to class with at least 3 questions for our guest speaker.</w:t>
-            </w:r>
-          </w:p>
-        </w:tc>
-      </w:tr>
-      <w:tr>
-        <w:tc>
-          <w:tcPr/>
-          <w:p>
-            <w:pPr>
-              <w:pStyle w:val="Compact"/>
-            </w:pPr>
-            <w:r>
               <w:t xml:space="preserve">13</w:t>
             </w:r>
           </w:p>
@@ -1881,11 +1800,7 @@
               <w:pStyle w:val="BodyText"/>
             </w:pPr>
             <w:r>
-              <w:rPr>
-                <w:b/>
-                <w:bCs/>
-              </w:rPr>
-              <w:t xml:space="preserve">[TODO: speaker blurb]</w:t>
+              <w:t xml:space="preserve">Dr. Cornelia Eisenach is a science journalist at Republik Magazin, where she writes about health and environmental topics. She holds a PhD in Biology from the University of Glasgow and was a postdoc at the University of Zurich before moving into journalism. In her talk, she will tell us about the challenges of climate change communication in journalism and how to overcome them.</w:t>
             </w:r>
           </w:p>
         </w:tc>
@@ -1954,71 +1869,13 @@
           <w:tcPr/>
           <w:p>
             <w:pPr>
-              <w:pStyle w:val="BodyText"/>
-            </w:pPr>
-            <w:r>
-              <w:t xml:space="preserve">Maibach, E. W., Uppalapati, S. S., Orr, M., &amp; Thaker, J. (2023). Harnessing the Power of Communication and Behavior Science to Enhance Society’s Response to Climate Change.</w:t>
-            </w:r>
-            <w:r>
-              <w:t xml:space="preserve"> </w:t>
-            </w:r>
-            <w:r>
-              <w:rPr>
-                <w:i/>
-                <w:iCs/>
-              </w:rPr>
-              <w:t xml:space="preserve">Annual Review of Earth and Planetary Sciences</w:t>
-            </w:r>
-            <w:r>
-              <w:t xml:space="preserve">,</w:t>
-            </w:r>
-            <w:r>
-              <w:t xml:space="preserve"> </w:t>
-            </w:r>
-            <w:r>
-              <w:rPr>
-                <w:i/>
-                <w:iCs/>
-              </w:rPr>
-              <w:t xml:space="preserve">51</w:t>
-            </w:r>
-            <w:r>
-              <w:t xml:space="preserve">(1).</w:t>
-            </w:r>
-            <w:r>
-              <w:t xml:space="preserve"> </w:t>
-            </w:r>
-            <w:hyperlink r:id="rId48">
-              <w:r>
-                <w:rPr>
-                  <w:rStyle w:val="Hyperlink"/>
-                </w:rPr>
-                <w:t xml:space="preserve">https://doi.org/10.1146/annurev-earth-031621-114417</w:t>
-              </w:r>
-            </w:hyperlink>
-          </w:p>
-          <w:p>
-            <w:pPr>
-              <w:pStyle w:val="BodyText"/>
-            </w:pPr>
-            <w:r>
-              <w:t xml:space="preserve">Corner et al. (2018). Principles for effective communication and public engagement on climate change.</w:t>
-            </w:r>
-            <w:r>
-              <w:t xml:space="preserve"> </w:t>
-            </w:r>
-            <w:r>
-              <w:rPr>
-                <w:b/>
-                <w:bCs/>
-              </w:rPr>
-              <w:t xml:space="preserve">[TODO: full citation missing from template’s reference list]</w:t>
-            </w:r>
+              <w:pStyle w:val="Compact"/>
+            </w:pPr>
           </w:p>
         </w:tc>
       </w:tr>
     </w:tbl>
-    <w:bookmarkEnd w:id="49"/>
+    <w:bookmarkEnd w:id="43"/>
     <w:sectPr>
       <w:footnotePr>
         <w:numRestart w:val="eachSect"/>
@@ -2351,6 +2208,45 @@
     </w:lvlOverride>
   </w:num>
   <w:num w:numId="1002">
+    <w:abstractNumId w:val="991"/>
+  </w:num>
+  <w:num w:numId="1003">
+    <w:abstractNumId w:val="99411"/>
+    <w:lvlOverride w:ilvl="0">
+      <w:startOverride w:val="1"/>
+    </w:lvlOverride>
+    <w:lvlOverride w:ilvl="1">
+      <w:startOverride w:val="1"/>
+    </w:lvlOverride>
+    <w:lvlOverride w:ilvl="2">
+      <w:startOverride w:val="1"/>
+    </w:lvlOverride>
+    <w:lvlOverride w:ilvl="3">
+      <w:startOverride w:val="1"/>
+    </w:lvlOverride>
+    <w:lvlOverride w:ilvl="4">
+      <w:startOverride w:val="1"/>
+    </w:lvlOverride>
+    <w:lvlOverride w:ilvl="5">
+      <w:startOverride w:val="1"/>
+    </w:lvlOverride>
+    <w:lvlOverride w:ilvl="6">
+      <w:startOverride w:val="1"/>
+    </w:lvlOverride>
+    <w:lvlOverride w:ilvl="7">
+      <w:startOverride w:val="1"/>
+    </w:lvlOverride>
+    <w:lvlOverride w:ilvl="8">
+      <w:startOverride w:val="1"/>
+    </w:lvlOverride>
+  </w:num>
+  <w:num w:numId="1004">
+    <w:abstractNumId w:val="991"/>
+  </w:num>
+  <w:num w:numId="1005">
+    <w:abstractNumId w:val="991"/>
+  </w:num>
+  <w:num w:numId="1006">
     <w:abstractNumId w:val="991"/>
   </w:num>
 </w:numbering>

</xml_diff>

<commit_message>
add blurb for communication to behavior class
</commit_message>
<xml_diff>
--- a/docs/syllabus.docx
+++ b/docs/syllabus.docx
@@ -1633,11 +1633,7 @@
               <w:pStyle w:val="BodyText"/>
             </w:pPr>
             <w:r>
-              <w:rPr>
-                <w:b/>
-                <w:bCs/>
-              </w:rPr>
-              <w:t xml:space="preserve">[TODO: description]</w:t>
+              <w:t xml:space="preserve">Which behaviors are most effective when it comes to climate change? How can we overcome the intention-action gap? What role can communication play for structural change?</w:t>
             </w:r>
           </w:p>
         </w:tc>

</xml_diff>

<commit_message>
add missing blurbs and minor changes to first slides
</commit_message>
<xml_diff>
--- a/docs/syllabus.docx
+++ b/docs/syllabus.docx
@@ -343,7 +343,21 @@
         <w:pStyle w:val="FirstParagraph"/>
       </w:pPr>
       <w:r>
-        <w:t xml:space="preserve">Course plan, reading materials, and slides will be available on Moodle and on https://github.com/janpfander/course_climate_communication. Please note that</w:t>
+        <w:t xml:space="preserve">Course plan, reading materials, and slides will be available on Moodle and on the</w:t>
+      </w:r>
+      <w:r>
+        <w:t xml:space="preserve"> </w:t>
+      </w:r>
+      <w:hyperlink r:id="rId28">
+        <w:r>
+          <w:rPr>
+            <w:rStyle w:val="Hyperlink"/>
+          </w:rPr>
+          <w:t xml:space="preserve">course website</w:t>
+        </w:r>
+      </w:hyperlink>
+      <w:r>
+        <w:t xml:space="preserve">. Please note that</w:t>
       </w:r>
       <w:r>
         <w:t xml:space="preserve"> </w:t>
@@ -454,7 +468,7 @@
         </w:numPr>
       </w:pPr>
       <w:r>
-        <w:t xml:space="preserve">Any type of content or message that focuses on climate change can be presented as an example, such as an advertisement, political campaign, social media post (video or text), newspaper article, etc. You can present good or bad examples of climate change communication, including messages on climate change denial, and be as creative as you want.</w:t>
+        <w:t xml:space="preserve">All group members need to actively present, with an approximately equal time split.</w:t>
       </w:r>
     </w:p>
     <w:p>
@@ -466,6 +480,18 @@
         </w:numPr>
       </w:pPr>
       <w:r>
+        <w:t xml:space="preserve">Any type of content or message that focuses on climate change can be presented as an example, such as an advertisement, political campaign, social media post (video or text), newspaper article, etc. You can present good or bad examples of climate change communication, including messages on climate change denial, and be as creative as you want.</w:t>
+      </w:r>
+    </w:p>
+    <w:p>
+      <w:pPr>
+        <w:pStyle w:val="Compact"/>
+        <w:numPr>
+          <w:ilvl w:val="0"/>
+          <w:numId w:val="1004"/>
+        </w:numPr>
+      </w:pPr>
+      <w:r>
         <w:t xml:space="preserve">Presentations need to introduce the content/message, address the following questions, and explicitly draw on relevant concepts learned in the course:</w:t>
       </w:r>
     </w:p>
@@ -556,7 +582,7 @@
         <w:pStyle w:val="FirstParagraph"/>
       </w:pPr>
       <w:r>
-        <w:t xml:space="preserve">Take some time to reflect on the group presentation following the structure below. Then write down your thoughts in 400–600 words and submit the reflection on Moodle by</w:t>
+        <w:t xml:space="preserve">Each group member writes their own, separate reflection and hands it in individually. Take some time to reflect on the group presentation following the structure below. Then write down your thoughts in 400–600 words and submit the reflection on Moodle by</w:t>
       </w:r>
       <w:r>
         <w:t xml:space="preserve"> </w:t>
@@ -769,7 +795,7 @@
               <w:pStyle w:val="BodyText"/>
             </w:pPr>
             <w:r>
-              <w:t xml:space="preserve">Markowitz, E. M., &amp; Guckian, M. L. (2018). Climate change communication: Challenges, insights, and opportunities. In S. Clayton &amp; C. Manning (Eds.),</w:t>
+              <w:t xml:space="preserve">Markowitz, E. M., &amp; Guckian, M. L. (2018). Climate change communication.</w:t>
             </w:r>
             <w:r>
               <w:t xml:space="preserve"> </w:t>
@@ -779,13 +805,10 @@
                 <w:i/>
                 <w:iCs/>
               </w:rPr>
-              <w:t xml:space="preserve">Psychology and Climate Change. Human Perceptions, Impacts, and Responses.</w:t>
-            </w:r>
-            <w:r>
-              <w:t xml:space="preserve"> </w:t>
-            </w:r>
-            <w:r>
-              <w:t xml:space="preserve">(pp. 35–63). Academic Press.</w:t>
+              <w:t xml:space="preserve">Psychology and Climate Change</w:t>
+            </w:r>
+            <w:r>
+              <w:t xml:space="preserve">, 35–63.</w:t>
             </w:r>
             <w:r>
               <w:t xml:space="preserve"> </w:t>
@@ -857,7 +880,37 @@
               <w:pStyle w:val="BodyText"/>
             </w:pPr>
             <w:r>
-              <w:t xml:space="preserve">Metag, J., Füchslin, T., &amp; Schäfer, M. S. (2017). Global warming’s five Germanys: A typology of Germans’ views on climate change and patterns of media use and information.</w:t>
+              <w:t xml:space="preserve">Metag, J., Füchslin, T., &amp; Schäfer, M. S. (2015). Global warming’s five</w:t>
+            </w:r>
+            <w:r>
+              <w:t xml:space="preserve"> </w:t>
+            </w:r>
+            <w:r>
+              <w:t xml:space="preserve">Germanys</w:t>
+            </w:r>
+            <w:r>
+              <w:t xml:space="preserve">:</w:t>
+            </w:r>
+            <w:r>
+              <w:t xml:space="preserve"> </w:t>
+            </w:r>
+            <w:r>
+              <w:t xml:space="preserve">A</w:t>
+            </w:r>
+            <w:r>
+              <w:t xml:space="preserve"> </w:t>
+            </w:r>
+            <w:r>
+              <w:t xml:space="preserve">typology of</w:t>
+            </w:r>
+            <w:r>
+              <w:t xml:space="preserve"> </w:t>
+            </w:r>
+            <w:r>
+              <w:t xml:space="preserve">Germans</w:t>
+            </w:r>
+            <w:r>
+              <w:t xml:space="preserve">’ views on climate change and patterns of media use and information.</w:t>
             </w:r>
             <w:r>
               <w:t xml:space="preserve"> </w:t>
@@ -955,7 +1008,19 @@
               <w:pStyle w:val="BodyText"/>
             </w:pPr>
             <w:r>
-              <w:t xml:space="preserve">Cologna, V., Kotcher, J., Mede, N. G., Besley, J., Maibach, E. W., &amp; Oreskes, N. (2024). Trust in climate science and climate scientists: A narrative review.</w:t>
+              <w:t xml:space="preserve">Cologna, V., Kotcher, J., Mede, N. G., Besley, J., Maibach, E. W., &amp; Oreskes, N. (2024). Trust in climate science and climate scientists:</w:t>
+            </w:r>
+            <w:r>
+              <w:t xml:space="preserve"> </w:t>
+            </w:r>
+            <w:r>
+              <w:t xml:space="preserve">A</w:t>
+            </w:r>
+            <w:r>
+              <w:t xml:space="preserve"> </w:t>
+            </w:r>
+            <w:r>
+              <w:t xml:space="preserve">narrative review.</w:t>
             </w:r>
             <w:r>
               <w:t xml:space="preserve"> </w:t>
@@ -1053,19 +1118,43 @@
               <w:pStyle w:val="BodyText"/>
             </w:pPr>
             <w:r>
-              <w:t xml:space="preserve">van der Linden, S., Maibach, E., &amp; Leiserowitz, A. (2015). Improving Public Engagement With Climate Change: Five</w:t>
-            </w:r>
-            <w:r>
-              <w:t xml:space="preserve"> </w:t>
-            </w:r>
-            <w:r>
-              <w:t xml:space="preserve">“Best Practice”</w:t>
-            </w:r>
-            <w:r>
-              <w:t xml:space="preserve"> </w:t>
-            </w:r>
-            <w:r>
-              <w:t xml:space="preserve">Insights From Psychological Science.</w:t>
+              <w:t xml:space="preserve">Van Der Linden, S., Maibach, E., &amp; Leiserowitz, A. (2015). Improving</w:t>
+            </w:r>
+            <w:r>
+              <w:t xml:space="preserve"> </w:t>
+            </w:r>
+            <w:r>
+              <w:t xml:space="preserve">Public Engagement With Climate Change</w:t>
+            </w:r>
+            <w:r>
+              <w:t xml:space="preserve">:</w:t>
+            </w:r>
+            <w:r>
+              <w:t xml:space="preserve"> </w:t>
+            </w:r>
+            <w:r>
+              <w:t xml:space="preserve">Five</w:t>
+            </w:r>
+            <w:r>
+              <w:t xml:space="preserve"> </w:t>
+            </w:r>
+            <w:r>
+              <w:t xml:space="preserve">“</w:t>
+            </w:r>
+            <w:r>
+              <w:t xml:space="preserve">Best Practice</w:t>
+            </w:r>
+            <w:r>
+              <w:t xml:space="preserve">”</w:t>
+            </w:r>
+            <w:r>
+              <w:t xml:space="preserve"> </w:t>
+            </w:r>
+            <w:r>
+              <w:t xml:space="preserve">Insights From Psychological Science</w:t>
+            </w:r>
+            <w:r>
+              <w:t xml:space="preserve">.</w:t>
             </w:r>
             <w:r>
               <w:t xml:space="preserve"> </w:t>
@@ -1091,7 +1180,7 @@
               <w:t xml:space="preserve">10</w:t>
             </w:r>
             <w:r>
-              <w:t xml:space="preserve">(6), 758-763.</w:t>
+              <w:t xml:space="preserve">(6), 758–763.</w:t>
             </w:r>
             <w:r>
               <w:t xml:space="preserve"> </w:t>
@@ -1163,7 +1252,19 @@
               <w:pStyle w:val="BodyText"/>
             </w:pPr>
             <w:r>
-              <w:t xml:space="preserve">Stanley, S. K., Hogg, T. L., Leviston, Z., &amp; Walker, I. (2021). From anger to action: Differential impacts of eco-anxiety, eco-depression, and eco-anger on climate action and wellbeing.</w:t>
+              <w:t xml:space="preserve">Stanley, S. K., Hogg, T. L., Leviston, Z., &amp; Walker, I. (2021). From anger to action:</w:t>
+            </w:r>
+            <w:r>
+              <w:t xml:space="preserve"> </w:t>
+            </w:r>
+            <w:r>
+              <w:t xml:space="preserve">Differential</w:t>
+            </w:r>
+            <w:r>
+              <w:t xml:space="preserve"> </w:t>
+            </w:r>
+            <w:r>
+              <w:t xml:space="preserve">impacts of eco-anxiety, eco-depression, and eco-anger on climate action and wellbeing.</w:t>
             </w:r>
             <w:r>
               <w:t xml:space="preserve"> </w:t>
@@ -1300,7 +1401,7 @@
                 <w:b/>
                 <w:bCs/>
               </w:rPr>
-              <w:t xml:space="preserve">Guest speaker: Dr. Reto Knutti</w:t>
+              <w:t xml:space="preserve">Guest speaker: Prof. Dr. Reto Knutti</w:t>
             </w:r>
             <w:r>
               <w:t xml:space="preserve"> — Invited speaker</w:t>
@@ -1311,11 +1412,7 @@
               <w:pStyle w:val="BodyText"/>
             </w:pPr>
             <w:r>
-              <w:rPr>
-                <w:b/>
-                <w:bCs/>
-              </w:rPr>
-              <w:t xml:space="preserve">[TODO: speaker blurb]</w:t>
+              <w:t xml:space="preserve">Prof. Dr. Reto Knutti is Professor of Climate Physics at the Institute for Atmospheric and Climate Science at ETH Zurich and has served as a lead author of the Intergovernmental Panel on Climate Change (IPCC) assessment reports.</w:t>
             </w:r>
           </w:p>
         </w:tc>
@@ -1387,7 +1484,67 @@
               <w:pStyle w:val="BodyText"/>
             </w:pPr>
             <w:r>
-              <w:t xml:space="preserve">Metag, J., Schäfer, M. S., Füchslin, T., Barsuhn, T., &amp; Kleinen-von Königslöw, K. (2016). Perceptions of Climate Change Imagery: Evoked Salience and Self-Efficacy in Germany, Switzerland, and Austria.</w:t>
+              <w:t xml:space="preserve">Metag, J., Schäfer, M. S., Füchslin, T., Barsuhn, T., &amp; Kleinen-von Königslöw, K. (2016). Perceptions of</w:t>
+            </w:r>
+            <w:r>
+              <w:t xml:space="preserve"> </w:t>
+            </w:r>
+            <w:r>
+              <w:t xml:space="preserve">Climate Change Imagery</w:t>
+            </w:r>
+            <w:r>
+              <w:t xml:space="preserve">:</w:t>
+            </w:r>
+            <w:r>
+              <w:t xml:space="preserve"> </w:t>
+            </w:r>
+            <w:r>
+              <w:t xml:space="preserve">Evoked Salience</w:t>
+            </w:r>
+            <w:r>
+              <w:t xml:space="preserve"> </w:t>
+            </w:r>
+            <w:r>
+              <w:t xml:space="preserve">and</w:t>
+            </w:r>
+            <w:r>
+              <w:t xml:space="preserve"> </w:t>
+            </w:r>
+            <w:r>
+              <w:t xml:space="preserve">Self-Efficacy</w:t>
+            </w:r>
+            <w:r>
+              <w:t xml:space="preserve"> </w:t>
+            </w:r>
+            <w:r>
+              <w:t xml:space="preserve">in</w:t>
+            </w:r>
+            <w:r>
+              <w:t xml:space="preserve"> </w:t>
+            </w:r>
+            <w:r>
+              <w:t xml:space="preserve">Germany</w:t>
+            </w:r>
+            <w:r>
+              <w:t xml:space="preserve">,</w:t>
+            </w:r>
+            <w:r>
+              <w:t xml:space="preserve"> </w:t>
+            </w:r>
+            <w:r>
+              <w:t xml:space="preserve">Switzerland</w:t>
+            </w:r>
+            <w:r>
+              <w:t xml:space="preserve">, and</w:t>
+            </w:r>
+            <w:r>
+              <w:t xml:space="preserve"> </w:t>
+            </w:r>
+            <w:r>
+              <w:t xml:space="preserve">Austria</w:t>
+            </w:r>
+            <w:r>
+              <w:t xml:space="preserve">.</w:t>
             </w:r>
             <w:r>
               <w:t xml:space="preserve"> </w:t>
@@ -1485,7 +1642,40 @@
               <w:pStyle w:val="BodyText"/>
             </w:pPr>
             <w:r>
-              <w:t xml:space="preserve">Lewandowsky, S. (2021). Climate Change Disinformation and How to Combat It.</w:t>
+              <w:t xml:space="preserve">Lewandowsky, S. (2021). Climate</w:t>
+            </w:r>
+            <w:r>
+              <w:t xml:space="preserve"> </w:t>
+            </w:r>
+            <w:r>
+              <w:t xml:space="preserve">Change Disinformation</w:t>
+            </w:r>
+            <w:r>
+              <w:t xml:space="preserve"> </w:t>
+            </w:r>
+            <w:r>
+              <w:t xml:space="preserve">and</w:t>
+            </w:r>
+            <w:r>
+              <w:t xml:space="preserve"> </w:t>
+            </w:r>
+            <w:r>
+              <w:t xml:space="preserve">How</w:t>
+            </w:r>
+            <w:r>
+              <w:t xml:space="preserve"> </w:t>
+            </w:r>
+            <w:r>
+              <w:t xml:space="preserve">to</w:t>
+            </w:r>
+            <w:r>
+              <w:t xml:space="preserve"> </w:t>
+            </w:r>
+            <w:r>
+              <w:t xml:space="preserve">Combat It</w:t>
+            </w:r>
+            <w:r>
+              <w:t xml:space="preserve">.</w:t>
             </w:r>
             <w:r>
               <w:t xml:space="preserve"> </w:t>
@@ -1511,7 +1701,7 @@
               <w:t xml:space="preserve">42</w:t>
             </w:r>
             <w:r>
-              <w:t xml:space="preserve">(1), 1-21.</w:t>
+              <w:t xml:space="preserve">, 1–21.</w:t>
             </w:r>
             <w:r>
               <w:t xml:space="preserve"> </w:t>
@@ -1644,7 +1834,7 @@
               <w:pStyle w:val="BodyText"/>
             </w:pPr>
             <w:r>
-              <w:t xml:space="preserve">Fielding, K.S., &amp; Hornsey, M.J. (2026). Understanding and reducing the intention–behaviour gap in climate action.</w:t>
+              <w:t xml:space="preserve">Fielding, K. S., &amp; Hornsey, M. J. (2026). Understanding and reducing the intention–behaviour gap in climate action.</w:t>
             </w:r>
             <w:r>
               <w:t xml:space="preserve"> </w:t>
@@ -1670,7 +1860,7 @@
               <w:t xml:space="preserve">16</w:t>
             </w:r>
             <w:r>
-              <w:t xml:space="preserve">(6), 638-647.</w:t>
+              <w:t xml:space="preserve">(6), 638–647.</w:t>
             </w:r>
             <w:r>
               <w:t xml:space="preserve"> </w:t>
@@ -1731,11 +1921,7 @@
               <w:pStyle w:val="BodyText"/>
             </w:pPr>
             <w:r>
-              <w:rPr>
-                <w:b/>
-                <w:bCs/>
-              </w:rPr>
-              <w:t xml:space="preserve">[TODO: speaker blurb]</w:t>
+              <w:t xml:space="preserve">Dr. Cornelia Staub is Head of Sustainability at Migros Industrie, the food and consumer goods production arm of the Migros Group.</w:t>
             </w:r>
           </w:p>
         </w:tc>

</xml_diff>